<commit_message>
refactor: update SimplePrompt with improved debugging and add prompt example
</commit_message>
<xml_diff>
--- a/src/backend/SKDemo.Examples/5-KernelMemory/Manta Ray corp.docx
+++ b/src/backend/SKDemo.Examples/5-KernelMemory/Manta Ray corp.docx
@@ -1,10 +1,13 @@
 
 <file path=word/document.xml><?xml version="1.0" encoding="utf-8"?>
-<w:document xmlns:wpc="http://schemas.microsoft.com/office/word/2010/wordprocessingCanvas" xmlns:cx="http://schemas.microsoft.com/office/drawing/2014/chartex" xmlns:cx1="http://schemas.microsoft.com/office/drawing/2015/9/8/chartex" xmlns:cx2="http://schemas.microsoft.com/office/drawing/2015/10/21/chartex" xmlns:cx3="http://schemas.microsoft.com/office/drawing/2016/5/9/chartex" xmlns:cx4="http://schemas.microsoft.com/office/drawing/2016/5/10/chartex" xmlns:cx5="http://schemas.microsoft.com/office/drawing/2016/5/11/chartex" xmlns:cx6="http://schemas.microsoft.com/office/drawing/2016/5/12/chartex" xmlns:cx7="http://schemas.microsoft.com/office/drawing/2016/5/13/chartex" xmlns:cx8="http://schemas.microsoft.com/office/drawing/2016/5/14/chartex" xmlns:mc="http://schemas.openxmlformats.org/markup-compatibility/2006" xmlns:aink="http://schemas.microsoft.com/office/drawing/2016/ink" xmlns:am3d="http://schemas.microsoft.com/office/drawing/2017/model3d" xmlns:o="urn:schemas-microsoft-com:office:office" xmlns:oel="http://schemas.microsoft.com/office/2019/extlst" xmlns:r="http://schemas.openxmlformats.org/officeDocument/2006/relationships" xmlns:m="http://schemas.openxmlformats.org/officeDocument/2006/math" xmlns:v="urn:schemas-microsoft-com:vml" xmlns:wp14="http://schemas.microsoft.com/office/word/2010/wordprocessingDrawing" xmlns:wp="http://schemas.openxmlformats.org/drawingml/2006/wordprocessingDrawing" xmlns:w10="urn:schemas-microsoft-com:office:word" xmlns:w="http://schemas.openxmlformats.org/wordprocessingml/2006/main" xmlns:w14="http://schemas.microsoft.com/office/word/2010/wordml" xmlns:w15="http://schemas.microsoft.com/office/word/2012/wordml" xmlns:w16cex="http://schemas.microsoft.com/office/word/2018/wordml/cex" xmlns:w16cid="http://schemas.microsoft.com/office/word/2016/wordml/cid" xmlns:w16="http://schemas.microsoft.com/office/word/2018/wordml" xmlns:w16du="http://schemas.microsoft.com/office/word/2023/wordml/word16du" xmlns:w16sdtdh="http://schemas.microsoft.com/office/word/2020/wordml/sdtdatahash" xmlns:w16se="http://schemas.microsoft.com/office/word/2015/wordml/symex" xmlns:wpg="http://schemas.microsoft.com/office/word/2010/wordprocessingGroup" xmlns:wpi="http://schemas.microsoft.com/office/word/2010/wordprocessingInk" xmlns:wne="http://schemas.microsoft.com/office/word/2006/wordml" xmlns:wps="http://schemas.microsoft.com/office/word/2010/wordprocessingShape" mc:Ignorable="w14 w15 w16se w16cid w16 w16cex w16sdtdh w16du wp14">
+<w:document xmlns:wpc="http://schemas.microsoft.com/office/word/2010/wordprocessingCanvas" xmlns:cx="http://schemas.microsoft.com/office/drawing/2014/chartex" xmlns:cx1="http://schemas.microsoft.com/office/drawing/2015/9/8/chartex" xmlns:cx2="http://schemas.microsoft.com/office/drawing/2015/10/21/chartex" xmlns:cx3="http://schemas.microsoft.com/office/drawing/2016/5/9/chartex" xmlns:cx4="http://schemas.microsoft.com/office/drawing/2016/5/10/chartex" xmlns:cx5="http://schemas.microsoft.com/office/drawing/2016/5/11/chartex" xmlns:cx6="http://schemas.microsoft.com/office/drawing/2016/5/12/chartex" xmlns:cx7="http://schemas.microsoft.com/office/drawing/2016/5/13/chartex" xmlns:cx8="http://schemas.microsoft.com/office/drawing/2016/5/14/chartex" xmlns:mc="http://schemas.openxmlformats.org/markup-compatibility/2006" xmlns:aink="http://schemas.microsoft.com/office/drawing/2016/ink" xmlns:am3d="http://schemas.microsoft.com/office/drawing/2017/model3d" xmlns:o="urn:schemas-microsoft-com:office:office" xmlns:oel="http://schemas.microsoft.com/office/2019/extlst" xmlns:r="http://schemas.openxmlformats.org/officeDocument/2006/relationships" xmlns:m="http://schemas.openxmlformats.org/officeDocument/2006/math" xmlns:v="urn:schemas-microsoft-com:vml" xmlns:wp14="http://schemas.microsoft.com/office/word/2010/wordprocessingDrawing" xmlns:wp="http://schemas.openxmlformats.org/drawingml/2006/wordprocessingDrawing" xmlns:w10="urn:schemas-microsoft-com:office:word" xmlns:w="http://schemas.openxmlformats.org/wordprocessingml/2006/main" xmlns:w14="http://schemas.microsoft.com/office/word/2010/wordml" xmlns:w15="http://schemas.microsoft.com/office/word/2012/wordml" xmlns:w16cex="http://schemas.microsoft.com/office/word/2018/wordml/cex" xmlns:w16cid="http://schemas.microsoft.com/office/word/2016/wordml/cid" xmlns:w16="http://schemas.microsoft.com/office/word/2018/wordml" xmlns:w16du="http://schemas.microsoft.com/office/word/2023/wordml/word16du" xmlns:w16sdtdh="http://schemas.microsoft.com/office/word/2020/wordml/sdtdatahash" xmlns:w16sdtfl="http://schemas.microsoft.com/office/word/2024/wordml/sdtformatlock" xmlns:w16se="http://schemas.microsoft.com/office/word/2015/wordml/symex" xmlns:wpg="http://schemas.microsoft.com/office/word/2010/wordprocessingGroup" xmlns:wpi="http://schemas.microsoft.com/office/word/2010/wordprocessingInk" xmlns:wne="http://schemas.microsoft.com/office/word/2006/wordml" xmlns:wps="http://schemas.microsoft.com/office/word/2010/wordprocessingShape" mc:Ignorable="w14 w15 w16se w16cid w16 w16cex w16sdtdh w16sdtfl w16du wp14">
   <w:body>
     <w:p>
       <w:r>
-        <w:t xml:space="preserve">Manta Ray </w:t>
+        <w:t>Manta Ray</w:t>
+      </w:r>
+      <w:r>
+        <w:t xml:space="preserve"> </w:t>
       </w:r>
       <w:proofErr w:type="spellStart"/>
       <w:r>
@@ -13,22 +16,220 @@
       <w:proofErr w:type="spellEnd"/>
     </w:p>
     <w:p>
-      <w:r>
-        <w:t>Has a suite of SAAS product that is a planning and scheduling system for the construction industry.</w:t>
-      </w:r>
+      <w:pPr>
+        <w:tabs>
+          <w:tab w:val="num" w:pos="720"/>
+        </w:tabs>
+      </w:pPr>
+      <w:r>
+        <w:t>Has a suite of S</w:t>
+      </w:r>
+      <w:r>
+        <w:t>aa</w:t>
+      </w:r>
+      <w:r>
+        <w:t>S product that is a planning and scheduling system for the construction industry.</w:t>
+      </w:r>
+      <w:r>
+        <w:br/>
+      </w:r>
+      <w:r>
+        <w:rPr>
+          <w:b/>
+          <w:bCs/>
+        </w:rPr>
+        <w:t>Product</w:t>
+      </w:r>
+      <w:r>
+        <w:t xml:space="preserve">: </w:t>
+      </w:r>
+      <w:proofErr w:type="spellStart"/>
+      <w:r>
+        <w:t>ProjectMaster</w:t>
+      </w:r>
+      <w:proofErr w:type="spellEnd"/>
     </w:p>
     <w:p>
       <w:r>
-        <w:t>All software systems are hosted in Azure.</w:t>
+        <w:rPr>
+          <w:b/>
+          <w:bCs/>
+        </w:rPr>
+        <w:t>Description</w:t>
+      </w:r>
+      <w:r>
+        <w:t xml:space="preserve">: Streamline your project management with </w:t>
+      </w:r>
+      <w:proofErr w:type="spellStart"/>
+      <w:r>
+        <w:t>ProjectMaster</w:t>
+      </w:r>
+      <w:proofErr w:type="spellEnd"/>
+      <w:r>
+        <w:t>. It offers tools for scheduling, budgeting, and real-time collaboration, ensuring every project is completed on time and within budget.</w:t>
       </w:r>
     </w:p>
     <w:p>
       <w:r>
-        <w:t>We use Azure container Apps and Azure functions for hosting our backends.</w:t>
-      </w:r>
+        <w:rPr>
+          <w:b/>
+          <w:bCs/>
+        </w:rPr>
+        <w:t>Product</w:t>
+      </w:r>
+      <w:r>
+        <w:t xml:space="preserve">: </w:t>
+      </w:r>
+      <w:proofErr w:type="spellStart"/>
+      <w:r>
+        <w:t>SiteSync</w:t>
+      </w:r>
+      <w:proofErr w:type="spellEnd"/>
     </w:p>
     <w:p>
       <w:r>
+        <w:rPr>
+          <w:b/>
+          <w:bCs/>
+        </w:rPr>
+        <w:t>Description</w:t>
+      </w:r>
+      <w:r>
+        <w:t xml:space="preserve">: Enhance site operations with </w:t>
+      </w:r>
+      <w:proofErr w:type="spellStart"/>
+      <w:r>
+        <w:t>SiteSync</w:t>
+      </w:r>
+      <w:proofErr w:type="spellEnd"/>
+      <w:r>
+        <w:t>. This platform provides real-time tracking, equipment management, and seamless communication between teams on and off the construction site.</w:t>
+      </w:r>
+    </w:p>
+    <w:p>
+      <w:r>
+        <w:rPr>
+          <w:b/>
+          <w:bCs/>
+        </w:rPr>
+        <w:t>Product</w:t>
+      </w:r>
+      <w:r>
+        <w:t xml:space="preserve">: </w:t>
+      </w:r>
+      <w:proofErr w:type="spellStart"/>
+      <w:r>
+        <w:t>TaskTitan</w:t>
+      </w:r>
+      <w:proofErr w:type="spellEnd"/>
+    </w:p>
+    <w:p>
+      <w:r>
+        <w:rPr>
+          <w:b/>
+          <w:bCs/>
+        </w:rPr>
+        <w:t>Description</w:t>
+      </w:r>
+      <w:r>
+        <w:t xml:space="preserve">: Manage tasks effortlessly with </w:t>
+      </w:r>
+      <w:proofErr w:type="spellStart"/>
+      <w:r>
+        <w:t>TaskTitan</w:t>
+      </w:r>
+      <w:proofErr w:type="spellEnd"/>
+      <w:r>
+        <w:t>. From task assignment to progress tracking, this tool ensures that every team member knows what to do and when, improving overall productivity.</w:t>
+      </w:r>
+    </w:p>
+    <w:p>
+      <w:r>
+        <w:rPr>
+          <w:b/>
+          <w:bCs/>
+        </w:rPr>
+        <w:t>Product</w:t>
+      </w:r>
+      <w:r>
+        <w:t xml:space="preserve">: </w:t>
+      </w:r>
+      <w:proofErr w:type="spellStart"/>
+      <w:r>
+        <w:t>PlanPro</w:t>
+      </w:r>
+      <w:proofErr w:type="spellEnd"/>
+    </w:p>
+    <w:p>
+      <w:r>
+        <w:rPr>
+          <w:b/>
+          <w:bCs/>
+        </w:rPr>
+        <w:t>Description</w:t>
+      </w:r>
+      <w:r>
+        <w:t xml:space="preserve">: Create detailed construction plans with </w:t>
+      </w:r>
+      <w:proofErr w:type="spellStart"/>
+      <w:r>
+        <w:t>PlanPro</w:t>
+      </w:r>
+      <w:proofErr w:type="spellEnd"/>
+      <w:r>
+        <w:t>. Featuring advanced design tools, document management, and easy sharing capabilities, it's perfect for architects and project managers alike.</w:t>
+      </w:r>
+    </w:p>
+    <w:p>
+      <w:r>
+        <w:rPr>
+          <w:b/>
+          <w:bCs/>
+        </w:rPr>
+        <w:t>Product</w:t>
+      </w:r>
+      <w:r>
+        <w:t xml:space="preserve">: </w:t>
+      </w:r>
+      <w:proofErr w:type="spellStart"/>
+      <w:r>
+        <w:t>BuildBuddy</w:t>
+      </w:r>
+      <w:proofErr w:type="spellEnd"/>
+    </w:p>
+    <w:p>
+      <w:r>
+        <w:rPr>
+          <w:b/>
+          <w:bCs/>
+        </w:rPr>
+        <w:t>Description</w:t>
+      </w:r>
+      <w:r>
+        <w:t xml:space="preserve">: Simplify construction workflows with </w:t>
+      </w:r>
+      <w:proofErr w:type="spellStart"/>
+      <w:r>
+        <w:t>BuildBuddy</w:t>
+      </w:r>
+      <w:proofErr w:type="spellEnd"/>
+      <w:r>
+        <w:t>. This platform offers features for procurement, inventory management, and cost tracking, helping construction firms stay organized and efficient.</w:t>
+      </w:r>
+    </w:p>
+    <w:p/>
+    <w:p>
+      <w:r>
+        <w:t>All software systems are hosted in Azure.</w:t>
+      </w:r>
+    </w:p>
+    <w:p>
+      <w:r>
+        <w:t>We use Azure container Apps and Azure functions for hosting our backends.</w:t>
+      </w:r>
+    </w:p>
+    <w:p>
+      <w:r>
         <w:t xml:space="preserve">We use Aurelia 2 for all our </w:t>
       </w:r>
       <w:proofErr w:type="gramStart"/>
@@ -38,6 +239,11 @@
       <w:proofErr w:type="gramEnd"/>
       <w:r>
         <w:t xml:space="preserve"> apps.</w:t>
+      </w:r>
+    </w:p>
+    <w:p>
+      <w:r>
+        <w:t>HQ Location: Dublin, Ireland</w:t>
       </w:r>
     </w:p>
     <w:p>
@@ -61,8 +267,889 @@
 </w:document>
 </file>
 
+<file path=word/numbering.xml><?xml version="1.0" encoding="utf-8"?>
+<w:numbering xmlns:wpc="http://schemas.microsoft.com/office/word/2010/wordprocessingCanvas" xmlns:cx="http://schemas.microsoft.com/office/drawing/2014/chartex" xmlns:cx1="http://schemas.microsoft.com/office/drawing/2015/9/8/chartex" xmlns:cx2="http://schemas.microsoft.com/office/drawing/2015/10/21/chartex" xmlns:cx3="http://schemas.microsoft.com/office/drawing/2016/5/9/chartex" xmlns:cx4="http://schemas.microsoft.com/office/drawing/2016/5/10/chartex" xmlns:cx5="http://schemas.microsoft.com/office/drawing/2016/5/11/chartex" xmlns:cx6="http://schemas.microsoft.com/office/drawing/2016/5/12/chartex" xmlns:cx7="http://schemas.microsoft.com/office/drawing/2016/5/13/chartex" xmlns:cx8="http://schemas.microsoft.com/office/drawing/2016/5/14/chartex" xmlns:mc="http://schemas.openxmlformats.org/markup-compatibility/2006" xmlns:aink="http://schemas.microsoft.com/office/drawing/2016/ink" xmlns:am3d="http://schemas.microsoft.com/office/drawing/2017/model3d" xmlns:o="urn:schemas-microsoft-com:office:office" xmlns:oel="http://schemas.microsoft.com/office/2019/extlst" xmlns:r="http://schemas.openxmlformats.org/officeDocument/2006/relationships" xmlns:m="http://schemas.openxmlformats.org/officeDocument/2006/math" xmlns:v="urn:schemas-microsoft-com:vml" xmlns:wp14="http://schemas.microsoft.com/office/word/2010/wordprocessingDrawing" xmlns:wp="http://schemas.openxmlformats.org/drawingml/2006/wordprocessingDrawing" xmlns:w10="urn:schemas-microsoft-com:office:word" xmlns:w="http://schemas.openxmlformats.org/wordprocessingml/2006/main" xmlns:w14="http://schemas.microsoft.com/office/word/2010/wordml" xmlns:w15="http://schemas.microsoft.com/office/word/2012/wordml" xmlns:w16cex="http://schemas.microsoft.com/office/word/2018/wordml/cex" xmlns:w16cid="http://schemas.microsoft.com/office/word/2016/wordml/cid" xmlns:w16="http://schemas.microsoft.com/office/word/2018/wordml" xmlns:w16du="http://schemas.microsoft.com/office/word/2023/wordml/word16du" xmlns:w16sdtdh="http://schemas.microsoft.com/office/word/2020/wordml/sdtdatahash" xmlns:w16sdtfl="http://schemas.microsoft.com/office/word/2024/wordml/sdtformatlock" xmlns:w16se="http://schemas.microsoft.com/office/word/2015/wordml/symex" xmlns:wpg="http://schemas.microsoft.com/office/word/2010/wordprocessingGroup" xmlns:wpi="http://schemas.microsoft.com/office/word/2010/wordprocessingInk" xmlns:wne="http://schemas.microsoft.com/office/word/2006/wordml" xmlns:wps="http://schemas.microsoft.com/office/word/2010/wordprocessingShape" mc:Ignorable="w14 w15 w16se w16cid w16 w16cex w16sdtdh w16sdtfl w16du wp14">
+  <w:abstractNum w:abstractNumId="0" w15:restartNumberingAfterBreak="0">
+    <w:nsid w:val="224D2B48"/>
+    <w:multiLevelType w:val="multilevel"/>
+    <w:tmpl w:val="67EAD3AC"/>
+    <w:lvl w:ilvl="0">
+      <w:start w:val="1"/>
+      <w:numFmt w:val="bullet"/>
+      <w:lvlText w:val=""/>
+      <w:lvlJc w:val="left"/>
+      <w:pPr>
+        <w:tabs>
+          <w:tab w:val="num" w:pos="720"/>
+        </w:tabs>
+        <w:ind w:left="720" w:hanging="360"/>
+      </w:pPr>
+      <w:rPr>
+        <w:rFonts w:ascii="Symbol" w:hAnsi="Symbol" w:hint="default"/>
+        <w:sz w:val="20"/>
+      </w:rPr>
+    </w:lvl>
+    <w:lvl w:ilvl="1" w:tentative="1">
+      <w:start w:val="1"/>
+      <w:numFmt w:val="bullet"/>
+      <w:lvlText w:val="o"/>
+      <w:lvlJc w:val="left"/>
+      <w:pPr>
+        <w:tabs>
+          <w:tab w:val="num" w:pos="1440"/>
+        </w:tabs>
+        <w:ind w:left="1440" w:hanging="360"/>
+      </w:pPr>
+      <w:rPr>
+        <w:rFonts w:ascii="Courier New" w:hAnsi="Courier New" w:hint="default"/>
+        <w:sz w:val="20"/>
+      </w:rPr>
+    </w:lvl>
+    <w:lvl w:ilvl="2" w:tentative="1">
+      <w:start w:val="1"/>
+      <w:numFmt w:val="bullet"/>
+      <w:lvlText w:val=""/>
+      <w:lvlJc w:val="left"/>
+      <w:pPr>
+        <w:tabs>
+          <w:tab w:val="num" w:pos="2160"/>
+        </w:tabs>
+        <w:ind w:left="2160" w:hanging="360"/>
+      </w:pPr>
+      <w:rPr>
+        <w:rFonts w:ascii="Wingdings" w:hAnsi="Wingdings" w:hint="default"/>
+        <w:sz w:val="20"/>
+      </w:rPr>
+    </w:lvl>
+    <w:lvl w:ilvl="3" w:tentative="1">
+      <w:start w:val="1"/>
+      <w:numFmt w:val="bullet"/>
+      <w:lvlText w:val=""/>
+      <w:lvlJc w:val="left"/>
+      <w:pPr>
+        <w:tabs>
+          <w:tab w:val="num" w:pos="2880"/>
+        </w:tabs>
+        <w:ind w:left="2880" w:hanging="360"/>
+      </w:pPr>
+      <w:rPr>
+        <w:rFonts w:ascii="Wingdings" w:hAnsi="Wingdings" w:hint="default"/>
+        <w:sz w:val="20"/>
+      </w:rPr>
+    </w:lvl>
+    <w:lvl w:ilvl="4" w:tentative="1">
+      <w:start w:val="1"/>
+      <w:numFmt w:val="bullet"/>
+      <w:lvlText w:val=""/>
+      <w:lvlJc w:val="left"/>
+      <w:pPr>
+        <w:tabs>
+          <w:tab w:val="num" w:pos="3600"/>
+        </w:tabs>
+        <w:ind w:left="3600" w:hanging="360"/>
+      </w:pPr>
+      <w:rPr>
+        <w:rFonts w:ascii="Wingdings" w:hAnsi="Wingdings" w:hint="default"/>
+        <w:sz w:val="20"/>
+      </w:rPr>
+    </w:lvl>
+    <w:lvl w:ilvl="5" w:tentative="1">
+      <w:start w:val="1"/>
+      <w:numFmt w:val="bullet"/>
+      <w:lvlText w:val=""/>
+      <w:lvlJc w:val="left"/>
+      <w:pPr>
+        <w:tabs>
+          <w:tab w:val="num" w:pos="4320"/>
+        </w:tabs>
+        <w:ind w:left="4320" w:hanging="360"/>
+      </w:pPr>
+      <w:rPr>
+        <w:rFonts w:ascii="Wingdings" w:hAnsi="Wingdings" w:hint="default"/>
+        <w:sz w:val="20"/>
+      </w:rPr>
+    </w:lvl>
+    <w:lvl w:ilvl="6" w:tentative="1">
+      <w:start w:val="1"/>
+      <w:numFmt w:val="bullet"/>
+      <w:lvlText w:val=""/>
+      <w:lvlJc w:val="left"/>
+      <w:pPr>
+        <w:tabs>
+          <w:tab w:val="num" w:pos="5040"/>
+        </w:tabs>
+        <w:ind w:left="5040" w:hanging="360"/>
+      </w:pPr>
+      <w:rPr>
+        <w:rFonts w:ascii="Wingdings" w:hAnsi="Wingdings" w:hint="default"/>
+        <w:sz w:val="20"/>
+      </w:rPr>
+    </w:lvl>
+    <w:lvl w:ilvl="7" w:tentative="1">
+      <w:start w:val="1"/>
+      <w:numFmt w:val="bullet"/>
+      <w:lvlText w:val=""/>
+      <w:lvlJc w:val="left"/>
+      <w:pPr>
+        <w:tabs>
+          <w:tab w:val="num" w:pos="5760"/>
+        </w:tabs>
+        <w:ind w:left="5760" w:hanging="360"/>
+      </w:pPr>
+      <w:rPr>
+        <w:rFonts w:ascii="Wingdings" w:hAnsi="Wingdings" w:hint="default"/>
+        <w:sz w:val="20"/>
+      </w:rPr>
+    </w:lvl>
+    <w:lvl w:ilvl="8" w:tentative="1">
+      <w:start w:val="1"/>
+      <w:numFmt w:val="bullet"/>
+      <w:lvlText w:val=""/>
+      <w:lvlJc w:val="left"/>
+      <w:pPr>
+        <w:tabs>
+          <w:tab w:val="num" w:pos="6480"/>
+        </w:tabs>
+        <w:ind w:left="6480" w:hanging="360"/>
+      </w:pPr>
+      <w:rPr>
+        <w:rFonts w:ascii="Wingdings" w:hAnsi="Wingdings" w:hint="default"/>
+        <w:sz w:val="20"/>
+      </w:rPr>
+    </w:lvl>
+  </w:abstractNum>
+  <w:abstractNum w:abstractNumId="1" w15:restartNumberingAfterBreak="0">
+    <w:nsid w:val="516F484D"/>
+    <w:multiLevelType w:val="multilevel"/>
+    <w:tmpl w:val="CFD4A53E"/>
+    <w:lvl w:ilvl="0">
+      <w:start w:val="1"/>
+      <w:numFmt w:val="bullet"/>
+      <w:lvlText w:val=""/>
+      <w:lvlJc w:val="left"/>
+      <w:pPr>
+        <w:tabs>
+          <w:tab w:val="num" w:pos="720"/>
+        </w:tabs>
+        <w:ind w:left="720" w:hanging="360"/>
+      </w:pPr>
+      <w:rPr>
+        <w:rFonts w:ascii="Symbol" w:hAnsi="Symbol" w:hint="default"/>
+        <w:sz w:val="20"/>
+      </w:rPr>
+    </w:lvl>
+    <w:lvl w:ilvl="1" w:tentative="1">
+      <w:start w:val="1"/>
+      <w:numFmt w:val="bullet"/>
+      <w:lvlText w:val="o"/>
+      <w:lvlJc w:val="left"/>
+      <w:pPr>
+        <w:tabs>
+          <w:tab w:val="num" w:pos="1440"/>
+        </w:tabs>
+        <w:ind w:left="1440" w:hanging="360"/>
+      </w:pPr>
+      <w:rPr>
+        <w:rFonts w:ascii="Courier New" w:hAnsi="Courier New" w:hint="default"/>
+        <w:sz w:val="20"/>
+      </w:rPr>
+    </w:lvl>
+    <w:lvl w:ilvl="2" w:tentative="1">
+      <w:start w:val="1"/>
+      <w:numFmt w:val="bullet"/>
+      <w:lvlText w:val=""/>
+      <w:lvlJc w:val="left"/>
+      <w:pPr>
+        <w:tabs>
+          <w:tab w:val="num" w:pos="2160"/>
+        </w:tabs>
+        <w:ind w:left="2160" w:hanging="360"/>
+      </w:pPr>
+      <w:rPr>
+        <w:rFonts w:ascii="Wingdings" w:hAnsi="Wingdings" w:hint="default"/>
+        <w:sz w:val="20"/>
+      </w:rPr>
+    </w:lvl>
+    <w:lvl w:ilvl="3" w:tentative="1">
+      <w:start w:val="1"/>
+      <w:numFmt w:val="bullet"/>
+      <w:lvlText w:val=""/>
+      <w:lvlJc w:val="left"/>
+      <w:pPr>
+        <w:tabs>
+          <w:tab w:val="num" w:pos="2880"/>
+        </w:tabs>
+        <w:ind w:left="2880" w:hanging="360"/>
+      </w:pPr>
+      <w:rPr>
+        <w:rFonts w:ascii="Wingdings" w:hAnsi="Wingdings" w:hint="default"/>
+        <w:sz w:val="20"/>
+      </w:rPr>
+    </w:lvl>
+    <w:lvl w:ilvl="4" w:tentative="1">
+      <w:start w:val="1"/>
+      <w:numFmt w:val="bullet"/>
+      <w:lvlText w:val=""/>
+      <w:lvlJc w:val="left"/>
+      <w:pPr>
+        <w:tabs>
+          <w:tab w:val="num" w:pos="3600"/>
+        </w:tabs>
+        <w:ind w:left="3600" w:hanging="360"/>
+      </w:pPr>
+      <w:rPr>
+        <w:rFonts w:ascii="Wingdings" w:hAnsi="Wingdings" w:hint="default"/>
+        <w:sz w:val="20"/>
+      </w:rPr>
+    </w:lvl>
+    <w:lvl w:ilvl="5" w:tentative="1">
+      <w:start w:val="1"/>
+      <w:numFmt w:val="bullet"/>
+      <w:lvlText w:val=""/>
+      <w:lvlJc w:val="left"/>
+      <w:pPr>
+        <w:tabs>
+          <w:tab w:val="num" w:pos="4320"/>
+        </w:tabs>
+        <w:ind w:left="4320" w:hanging="360"/>
+      </w:pPr>
+      <w:rPr>
+        <w:rFonts w:ascii="Wingdings" w:hAnsi="Wingdings" w:hint="default"/>
+        <w:sz w:val="20"/>
+      </w:rPr>
+    </w:lvl>
+    <w:lvl w:ilvl="6" w:tentative="1">
+      <w:start w:val="1"/>
+      <w:numFmt w:val="bullet"/>
+      <w:lvlText w:val=""/>
+      <w:lvlJc w:val="left"/>
+      <w:pPr>
+        <w:tabs>
+          <w:tab w:val="num" w:pos="5040"/>
+        </w:tabs>
+        <w:ind w:left="5040" w:hanging="360"/>
+      </w:pPr>
+      <w:rPr>
+        <w:rFonts w:ascii="Wingdings" w:hAnsi="Wingdings" w:hint="default"/>
+        <w:sz w:val="20"/>
+      </w:rPr>
+    </w:lvl>
+    <w:lvl w:ilvl="7" w:tentative="1">
+      <w:start w:val="1"/>
+      <w:numFmt w:val="bullet"/>
+      <w:lvlText w:val=""/>
+      <w:lvlJc w:val="left"/>
+      <w:pPr>
+        <w:tabs>
+          <w:tab w:val="num" w:pos="5760"/>
+        </w:tabs>
+        <w:ind w:left="5760" w:hanging="360"/>
+      </w:pPr>
+      <w:rPr>
+        <w:rFonts w:ascii="Wingdings" w:hAnsi="Wingdings" w:hint="default"/>
+        <w:sz w:val="20"/>
+      </w:rPr>
+    </w:lvl>
+    <w:lvl w:ilvl="8" w:tentative="1">
+      <w:start w:val="1"/>
+      <w:numFmt w:val="bullet"/>
+      <w:lvlText w:val=""/>
+      <w:lvlJc w:val="left"/>
+      <w:pPr>
+        <w:tabs>
+          <w:tab w:val="num" w:pos="6480"/>
+        </w:tabs>
+        <w:ind w:left="6480" w:hanging="360"/>
+      </w:pPr>
+      <w:rPr>
+        <w:rFonts w:ascii="Wingdings" w:hAnsi="Wingdings" w:hint="default"/>
+        <w:sz w:val="20"/>
+      </w:rPr>
+    </w:lvl>
+  </w:abstractNum>
+  <w:abstractNum w:abstractNumId="2" w15:restartNumberingAfterBreak="0">
+    <w:nsid w:val="51C65608"/>
+    <w:multiLevelType w:val="multilevel"/>
+    <w:tmpl w:val="6E2064D6"/>
+    <w:lvl w:ilvl="0">
+      <w:start w:val="1"/>
+      <w:numFmt w:val="bullet"/>
+      <w:lvlText w:val=""/>
+      <w:lvlJc w:val="left"/>
+      <w:pPr>
+        <w:tabs>
+          <w:tab w:val="num" w:pos="720"/>
+        </w:tabs>
+        <w:ind w:left="720" w:hanging="360"/>
+      </w:pPr>
+      <w:rPr>
+        <w:rFonts w:ascii="Symbol" w:hAnsi="Symbol" w:hint="default"/>
+        <w:sz w:val="20"/>
+      </w:rPr>
+    </w:lvl>
+    <w:lvl w:ilvl="1" w:tentative="1">
+      <w:start w:val="1"/>
+      <w:numFmt w:val="bullet"/>
+      <w:lvlText w:val="o"/>
+      <w:lvlJc w:val="left"/>
+      <w:pPr>
+        <w:tabs>
+          <w:tab w:val="num" w:pos="1440"/>
+        </w:tabs>
+        <w:ind w:left="1440" w:hanging="360"/>
+      </w:pPr>
+      <w:rPr>
+        <w:rFonts w:ascii="Courier New" w:hAnsi="Courier New" w:hint="default"/>
+        <w:sz w:val="20"/>
+      </w:rPr>
+    </w:lvl>
+    <w:lvl w:ilvl="2" w:tentative="1">
+      <w:start w:val="1"/>
+      <w:numFmt w:val="bullet"/>
+      <w:lvlText w:val=""/>
+      <w:lvlJc w:val="left"/>
+      <w:pPr>
+        <w:tabs>
+          <w:tab w:val="num" w:pos="2160"/>
+        </w:tabs>
+        <w:ind w:left="2160" w:hanging="360"/>
+      </w:pPr>
+      <w:rPr>
+        <w:rFonts w:ascii="Wingdings" w:hAnsi="Wingdings" w:hint="default"/>
+        <w:sz w:val="20"/>
+      </w:rPr>
+    </w:lvl>
+    <w:lvl w:ilvl="3" w:tentative="1">
+      <w:start w:val="1"/>
+      <w:numFmt w:val="bullet"/>
+      <w:lvlText w:val=""/>
+      <w:lvlJc w:val="left"/>
+      <w:pPr>
+        <w:tabs>
+          <w:tab w:val="num" w:pos="2880"/>
+        </w:tabs>
+        <w:ind w:left="2880" w:hanging="360"/>
+      </w:pPr>
+      <w:rPr>
+        <w:rFonts w:ascii="Wingdings" w:hAnsi="Wingdings" w:hint="default"/>
+        <w:sz w:val="20"/>
+      </w:rPr>
+    </w:lvl>
+    <w:lvl w:ilvl="4" w:tentative="1">
+      <w:start w:val="1"/>
+      <w:numFmt w:val="bullet"/>
+      <w:lvlText w:val=""/>
+      <w:lvlJc w:val="left"/>
+      <w:pPr>
+        <w:tabs>
+          <w:tab w:val="num" w:pos="3600"/>
+        </w:tabs>
+        <w:ind w:left="3600" w:hanging="360"/>
+      </w:pPr>
+      <w:rPr>
+        <w:rFonts w:ascii="Wingdings" w:hAnsi="Wingdings" w:hint="default"/>
+        <w:sz w:val="20"/>
+      </w:rPr>
+    </w:lvl>
+    <w:lvl w:ilvl="5" w:tentative="1">
+      <w:start w:val="1"/>
+      <w:numFmt w:val="bullet"/>
+      <w:lvlText w:val=""/>
+      <w:lvlJc w:val="left"/>
+      <w:pPr>
+        <w:tabs>
+          <w:tab w:val="num" w:pos="4320"/>
+        </w:tabs>
+        <w:ind w:left="4320" w:hanging="360"/>
+      </w:pPr>
+      <w:rPr>
+        <w:rFonts w:ascii="Wingdings" w:hAnsi="Wingdings" w:hint="default"/>
+        <w:sz w:val="20"/>
+      </w:rPr>
+    </w:lvl>
+    <w:lvl w:ilvl="6" w:tentative="1">
+      <w:start w:val="1"/>
+      <w:numFmt w:val="bullet"/>
+      <w:lvlText w:val=""/>
+      <w:lvlJc w:val="left"/>
+      <w:pPr>
+        <w:tabs>
+          <w:tab w:val="num" w:pos="5040"/>
+        </w:tabs>
+        <w:ind w:left="5040" w:hanging="360"/>
+      </w:pPr>
+      <w:rPr>
+        <w:rFonts w:ascii="Wingdings" w:hAnsi="Wingdings" w:hint="default"/>
+        <w:sz w:val="20"/>
+      </w:rPr>
+    </w:lvl>
+    <w:lvl w:ilvl="7" w:tentative="1">
+      <w:start w:val="1"/>
+      <w:numFmt w:val="bullet"/>
+      <w:lvlText w:val=""/>
+      <w:lvlJc w:val="left"/>
+      <w:pPr>
+        <w:tabs>
+          <w:tab w:val="num" w:pos="5760"/>
+        </w:tabs>
+        <w:ind w:left="5760" w:hanging="360"/>
+      </w:pPr>
+      <w:rPr>
+        <w:rFonts w:ascii="Wingdings" w:hAnsi="Wingdings" w:hint="default"/>
+        <w:sz w:val="20"/>
+      </w:rPr>
+    </w:lvl>
+    <w:lvl w:ilvl="8" w:tentative="1">
+      <w:start w:val="1"/>
+      <w:numFmt w:val="bullet"/>
+      <w:lvlText w:val=""/>
+      <w:lvlJc w:val="left"/>
+      <w:pPr>
+        <w:tabs>
+          <w:tab w:val="num" w:pos="6480"/>
+        </w:tabs>
+        <w:ind w:left="6480" w:hanging="360"/>
+      </w:pPr>
+      <w:rPr>
+        <w:rFonts w:ascii="Wingdings" w:hAnsi="Wingdings" w:hint="default"/>
+        <w:sz w:val="20"/>
+      </w:rPr>
+    </w:lvl>
+  </w:abstractNum>
+  <w:abstractNum w:abstractNumId="3" w15:restartNumberingAfterBreak="0">
+    <w:nsid w:val="52F547E9"/>
+    <w:multiLevelType w:val="multilevel"/>
+    <w:tmpl w:val="15D04EF4"/>
+    <w:lvl w:ilvl="0">
+      <w:start w:val="1"/>
+      <w:numFmt w:val="bullet"/>
+      <w:lvlText w:val=""/>
+      <w:lvlJc w:val="left"/>
+      <w:pPr>
+        <w:tabs>
+          <w:tab w:val="num" w:pos="720"/>
+        </w:tabs>
+        <w:ind w:left="720" w:hanging="360"/>
+      </w:pPr>
+      <w:rPr>
+        <w:rFonts w:ascii="Symbol" w:hAnsi="Symbol" w:hint="default"/>
+        <w:sz w:val="20"/>
+      </w:rPr>
+    </w:lvl>
+    <w:lvl w:ilvl="1" w:tentative="1">
+      <w:start w:val="1"/>
+      <w:numFmt w:val="bullet"/>
+      <w:lvlText w:val="o"/>
+      <w:lvlJc w:val="left"/>
+      <w:pPr>
+        <w:tabs>
+          <w:tab w:val="num" w:pos="1440"/>
+        </w:tabs>
+        <w:ind w:left="1440" w:hanging="360"/>
+      </w:pPr>
+      <w:rPr>
+        <w:rFonts w:ascii="Courier New" w:hAnsi="Courier New" w:hint="default"/>
+        <w:sz w:val="20"/>
+      </w:rPr>
+    </w:lvl>
+    <w:lvl w:ilvl="2" w:tentative="1">
+      <w:start w:val="1"/>
+      <w:numFmt w:val="bullet"/>
+      <w:lvlText w:val=""/>
+      <w:lvlJc w:val="left"/>
+      <w:pPr>
+        <w:tabs>
+          <w:tab w:val="num" w:pos="2160"/>
+        </w:tabs>
+        <w:ind w:left="2160" w:hanging="360"/>
+      </w:pPr>
+      <w:rPr>
+        <w:rFonts w:ascii="Wingdings" w:hAnsi="Wingdings" w:hint="default"/>
+        <w:sz w:val="20"/>
+      </w:rPr>
+    </w:lvl>
+    <w:lvl w:ilvl="3" w:tentative="1">
+      <w:start w:val="1"/>
+      <w:numFmt w:val="bullet"/>
+      <w:lvlText w:val=""/>
+      <w:lvlJc w:val="left"/>
+      <w:pPr>
+        <w:tabs>
+          <w:tab w:val="num" w:pos="2880"/>
+        </w:tabs>
+        <w:ind w:left="2880" w:hanging="360"/>
+      </w:pPr>
+      <w:rPr>
+        <w:rFonts w:ascii="Wingdings" w:hAnsi="Wingdings" w:hint="default"/>
+        <w:sz w:val="20"/>
+      </w:rPr>
+    </w:lvl>
+    <w:lvl w:ilvl="4" w:tentative="1">
+      <w:start w:val="1"/>
+      <w:numFmt w:val="bullet"/>
+      <w:lvlText w:val=""/>
+      <w:lvlJc w:val="left"/>
+      <w:pPr>
+        <w:tabs>
+          <w:tab w:val="num" w:pos="3600"/>
+        </w:tabs>
+        <w:ind w:left="3600" w:hanging="360"/>
+      </w:pPr>
+      <w:rPr>
+        <w:rFonts w:ascii="Wingdings" w:hAnsi="Wingdings" w:hint="default"/>
+        <w:sz w:val="20"/>
+      </w:rPr>
+    </w:lvl>
+    <w:lvl w:ilvl="5" w:tentative="1">
+      <w:start w:val="1"/>
+      <w:numFmt w:val="bullet"/>
+      <w:lvlText w:val=""/>
+      <w:lvlJc w:val="left"/>
+      <w:pPr>
+        <w:tabs>
+          <w:tab w:val="num" w:pos="4320"/>
+        </w:tabs>
+        <w:ind w:left="4320" w:hanging="360"/>
+      </w:pPr>
+      <w:rPr>
+        <w:rFonts w:ascii="Wingdings" w:hAnsi="Wingdings" w:hint="default"/>
+        <w:sz w:val="20"/>
+      </w:rPr>
+    </w:lvl>
+    <w:lvl w:ilvl="6" w:tentative="1">
+      <w:start w:val="1"/>
+      <w:numFmt w:val="bullet"/>
+      <w:lvlText w:val=""/>
+      <w:lvlJc w:val="left"/>
+      <w:pPr>
+        <w:tabs>
+          <w:tab w:val="num" w:pos="5040"/>
+        </w:tabs>
+        <w:ind w:left="5040" w:hanging="360"/>
+      </w:pPr>
+      <w:rPr>
+        <w:rFonts w:ascii="Wingdings" w:hAnsi="Wingdings" w:hint="default"/>
+        <w:sz w:val="20"/>
+      </w:rPr>
+    </w:lvl>
+    <w:lvl w:ilvl="7" w:tentative="1">
+      <w:start w:val="1"/>
+      <w:numFmt w:val="bullet"/>
+      <w:lvlText w:val=""/>
+      <w:lvlJc w:val="left"/>
+      <w:pPr>
+        <w:tabs>
+          <w:tab w:val="num" w:pos="5760"/>
+        </w:tabs>
+        <w:ind w:left="5760" w:hanging="360"/>
+      </w:pPr>
+      <w:rPr>
+        <w:rFonts w:ascii="Wingdings" w:hAnsi="Wingdings" w:hint="default"/>
+        <w:sz w:val="20"/>
+      </w:rPr>
+    </w:lvl>
+    <w:lvl w:ilvl="8" w:tentative="1">
+      <w:start w:val="1"/>
+      <w:numFmt w:val="bullet"/>
+      <w:lvlText w:val=""/>
+      <w:lvlJc w:val="left"/>
+      <w:pPr>
+        <w:tabs>
+          <w:tab w:val="num" w:pos="6480"/>
+        </w:tabs>
+        <w:ind w:left="6480" w:hanging="360"/>
+      </w:pPr>
+      <w:rPr>
+        <w:rFonts w:ascii="Wingdings" w:hAnsi="Wingdings" w:hint="default"/>
+        <w:sz w:val="20"/>
+      </w:rPr>
+    </w:lvl>
+  </w:abstractNum>
+  <w:abstractNum w:abstractNumId="4" w15:restartNumberingAfterBreak="0">
+    <w:nsid w:val="5A400675"/>
+    <w:multiLevelType w:val="multilevel"/>
+    <w:tmpl w:val="B6B6EC34"/>
+    <w:lvl w:ilvl="0">
+      <w:start w:val="1"/>
+      <w:numFmt w:val="bullet"/>
+      <w:lvlText w:val=""/>
+      <w:lvlJc w:val="left"/>
+      <w:pPr>
+        <w:tabs>
+          <w:tab w:val="num" w:pos="720"/>
+        </w:tabs>
+        <w:ind w:left="720" w:hanging="360"/>
+      </w:pPr>
+      <w:rPr>
+        <w:rFonts w:ascii="Symbol" w:hAnsi="Symbol" w:hint="default"/>
+        <w:sz w:val="20"/>
+      </w:rPr>
+    </w:lvl>
+    <w:lvl w:ilvl="1" w:tentative="1">
+      <w:start w:val="1"/>
+      <w:numFmt w:val="bullet"/>
+      <w:lvlText w:val="o"/>
+      <w:lvlJc w:val="left"/>
+      <w:pPr>
+        <w:tabs>
+          <w:tab w:val="num" w:pos="1440"/>
+        </w:tabs>
+        <w:ind w:left="1440" w:hanging="360"/>
+      </w:pPr>
+      <w:rPr>
+        <w:rFonts w:ascii="Courier New" w:hAnsi="Courier New" w:hint="default"/>
+        <w:sz w:val="20"/>
+      </w:rPr>
+    </w:lvl>
+    <w:lvl w:ilvl="2" w:tentative="1">
+      <w:start w:val="1"/>
+      <w:numFmt w:val="bullet"/>
+      <w:lvlText w:val=""/>
+      <w:lvlJc w:val="left"/>
+      <w:pPr>
+        <w:tabs>
+          <w:tab w:val="num" w:pos="2160"/>
+        </w:tabs>
+        <w:ind w:left="2160" w:hanging="360"/>
+      </w:pPr>
+      <w:rPr>
+        <w:rFonts w:ascii="Wingdings" w:hAnsi="Wingdings" w:hint="default"/>
+        <w:sz w:val="20"/>
+      </w:rPr>
+    </w:lvl>
+    <w:lvl w:ilvl="3" w:tentative="1">
+      <w:start w:val="1"/>
+      <w:numFmt w:val="bullet"/>
+      <w:lvlText w:val=""/>
+      <w:lvlJc w:val="left"/>
+      <w:pPr>
+        <w:tabs>
+          <w:tab w:val="num" w:pos="2880"/>
+        </w:tabs>
+        <w:ind w:left="2880" w:hanging="360"/>
+      </w:pPr>
+      <w:rPr>
+        <w:rFonts w:ascii="Wingdings" w:hAnsi="Wingdings" w:hint="default"/>
+        <w:sz w:val="20"/>
+      </w:rPr>
+    </w:lvl>
+    <w:lvl w:ilvl="4" w:tentative="1">
+      <w:start w:val="1"/>
+      <w:numFmt w:val="bullet"/>
+      <w:lvlText w:val=""/>
+      <w:lvlJc w:val="left"/>
+      <w:pPr>
+        <w:tabs>
+          <w:tab w:val="num" w:pos="3600"/>
+        </w:tabs>
+        <w:ind w:left="3600" w:hanging="360"/>
+      </w:pPr>
+      <w:rPr>
+        <w:rFonts w:ascii="Wingdings" w:hAnsi="Wingdings" w:hint="default"/>
+        <w:sz w:val="20"/>
+      </w:rPr>
+    </w:lvl>
+    <w:lvl w:ilvl="5" w:tentative="1">
+      <w:start w:val="1"/>
+      <w:numFmt w:val="bullet"/>
+      <w:lvlText w:val=""/>
+      <w:lvlJc w:val="left"/>
+      <w:pPr>
+        <w:tabs>
+          <w:tab w:val="num" w:pos="4320"/>
+        </w:tabs>
+        <w:ind w:left="4320" w:hanging="360"/>
+      </w:pPr>
+      <w:rPr>
+        <w:rFonts w:ascii="Wingdings" w:hAnsi="Wingdings" w:hint="default"/>
+        <w:sz w:val="20"/>
+      </w:rPr>
+    </w:lvl>
+    <w:lvl w:ilvl="6" w:tentative="1">
+      <w:start w:val="1"/>
+      <w:numFmt w:val="bullet"/>
+      <w:lvlText w:val=""/>
+      <w:lvlJc w:val="left"/>
+      <w:pPr>
+        <w:tabs>
+          <w:tab w:val="num" w:pos="5040"/>
+        </w:tabs>
+        <w:ind w:left="5040" w:hanging="360"/>
+      </w:pPr>
+      <w:rPr>
+        <w:rFonts w:ascii="Wingdings" w:hAnsi="Wingdings" w:hint="default"/>
+        <w:sz w:val="20"/>
+      </w:rPr>
+    </w:lvl>
+    <w:lvl w:ilvl="7" w:tentative="1">
+      <w:start w:val="1"/>
+      <w:numFmt w:val="bullet"/>
+      <w:lvlText w:val=""/>
+      <w:lvlJc w:val="left"/>
+      <w:pPr>
+        <w:tabs>
+          <w:tab w:val="num" w:pos="5760"/>
+        </w:tabs>
+        <w:ind w:left="5760" w:hanging="360"/>
+      </w:pPr>
+      <w:rPr>
+        <w:rFonts w:ascii="Wingdings" w:hAnsi="Wingdings" w:hint="default"/>
+        <w:sz w:val="20"/>
+      </w:rPr>
+    </w:lvl>
+    <w:lvl w:ilvl="8" w:tentative="1">
+      <w:start w:val="1"/>
+      <w:numFmt w:val="bullet"/>
+      <w:lvlText w:val=""/>
+      <w:lvlJc w:val="left"/>
+      <w:pPr>
+        <w:tabs>
+          <w:tab w:val="num" w:pos="6480"/>
+        </w:tabs>
+        <w:ind w:left="6480" w:hanging="360"/>
+      </w:pPr>
+      <w:rPr>
+        <w:rFonts w:ascii="Wingdings" w:hAnsi="Wingdings" w:hint="default"/>
+        <w:sz w:val="20"/>
+      </w:rPr>
+    </w:lvl>
+  </w:abstractNum>
+  <w:abstractNum w:abstractNumId="5" w15:restartNumberingAfterBreak="0">
+    <w:nsid w:val="6ABB60C1"/>
+    <w:multiLevelType w:val="hybridMultilevel"/>
+    <w:tmpl w:val="11424C50"/>
+    <w:lvl w:ilvl="0" w:tplc="20000001">
+      <w:start w:val="1"/>
+      <w:numFmt w:val="bullet"/>
+      <w:lvlText w:val=""/>
+      <w:lvlJc w:val="left"/>
+      <w:pPr>
+        <w:ind w:left="1080" w:hanging="360"/>
+      </w:pPr>
+      <w:rPr>
+        <w:rFonts w:ascii="Symbol" w:hAnsi="Symbol" w:hint="default"/>
+      </w:rPr>
+    </w:lvl>
+    <w:lvl w:ilvl="1" w:tplc="20000003" w:tentative="1">
+      <w:start w:val="1"/>
+      <w:numFmt w:val="bullet"/>
+      <w:lvlText w:val="o"/>
+      <w:lvlJc w:val="left"/>
+      <w:pPr>
+        <w:ind w:left="1800" w:hanging="360"/>
+      </w:pPr>
+      <w:rPr>
+        <w:rFonts w:ascii="Courier New" w:hAnsi="Courier New" w:cs="Courier New" w:hint="default"/>
+      </w:rPr>
+    </w:lvl>
+    <w:lvl w:ilvl="2" w:tplc="20000005" w:tentative="1">
+      <w:start w:val="1"/>
+      <w:numFmt w:val="bullet"/>
+      <w:lvlText w:val=""/>
+      <w:lvlJc w:val="left"/>
+      <w:pPr>
+        <w:ind w:left="2520" w:hanging="360"/>
+      </w:pPr>
+      <w:rPr>
+        <w:rFonts w:ascii="Wingdings" w:hAnsi="Wingdings" w:hint="default"/>
+      </w:rPr>
+    </w:lvl>
+    <w:lvl w:ilvl="3" w:tplc="20000001" w:tentative="1">
+      <w:start w:val="1"/>
+      <w:numFmt w:val="bullet"/>
+      <w:lvlText w:val=""/>
+      <w:lvlJc w:val="left"/>
+      <w:pPr>
+        <w:ind w:left="3240" w:hanging="360"/>
+      </w:pPr>
+      <w:rPr>
+        <w:rFonts w:ascii="Symbol" w:hAnsi="Symbol" w:hint="default"/>
+      </w:rPr>
+    </w:lvl>
+    <w:lvl w:ilvl="4" w:tplc="20000003" w:tentative="1">
+      <w:start w:val="1"/>
+      <w:numFmt w:val="bullet"/>
+      <w:lvlText w:val="o"/>
+      <w:lvlJc w:val="left"/>
+      <w:pPr>
+        <w:ind w:left="3960" w:hanging="360"/>
+      </w:pPr>
+      <w:rPr>
+        <w:rFonts w:ascii="Courier New" w:hAnsi="Courier New" w:cs="Courier New" w:hint="default"/>
+      </w:rPr>
+    </w:lvl>
+    <w:lvl w:ilvl="5" w:tplc="20000005" w:tentative="1">
+      <w:start w:val="1"/>
+      <w:numFmt w:val="bullet"/>
+      <w:lvlText w:val=""/>
+      <w:lvlJc w:val="left"/>
+      <w:pPr>
+        <w:ind w:left="4680" w:hanging="360"/>
+      </w:pPr>
+      <w:rPr>
+        <w:rFonts w:ascii="Wingdings" w:hAnsi="Wingdings" w:hint="default"/>
+      </w:rPr>
+    </w:lvl>
+    <w:lvl w:ilvl="6" w:tplc="20000001" w:tentative="1">
+      <w:start w:val="1"/>
+      <w:numFmt w:val="bullet"/>
+      <w:lvlText w:val=""/>
+      <w:lvlJc w:val="left"/>
+      <w:pPr>
+        <w:ind w:left="5400" w:hanging="360"/>
+      </w:pPr>
+      <w:rPr>
+        <w:rFonts w:ascii="Symbol" w:hAnsi="Symbol" w:hint="default"/>
+      </w:rPr>
+    </w:lvl>
+    <w:lvl w:ilvl="7" w:tplc="20000003" w:tentative="1">
+      <w:start w:val="1"/>
+      <w:numFmt w:val="bullet"/>
+      <w:lvlText w:val="o"/>
+      <w:lvlJc w:val="left"/>
+      <w:pPr>
+        <w:ind w:left="6120" w:hanging="360"/>
+      </w:pPr>
+      <w:rPr>
+        <w:rFonts w:ascii="Courier New" w:hAnsi="Courier New" w:cs="Courier New" w:hint="default"/>
+      </w:rPr>
+    </w:lvl>
+    <w:lvl w:ilvl="8" w:tplc="20000005" w:tentative="1">
+      <w:start w:val="1"/>
+      <w:numFmt w:val="bullet"/>
+      <w:lvlText w:val=""/>
+      <w:lvlJc w:val="left"/>
+      <w:pPr>
+        <w:ind w:left="6840" w:hanging="360"/>
+      </w:pPr>
+      <w:rPr>
+        <w:rFonts w:ascii="Wingdings" w:hAnsi="Wingdings" w:hint="default"/>
+      </w:rPr>
+    </w:lvl>
+  </w:abstractNum>
+  <w:num w:numId="1" w16cid:durableId="136071695">
+    <w:abstractNumId w:val="0"/>
+  </w:num>
+  <w:num w:numId="2" w16cid:durableId="556091118">
+    <w:abstractNumId w:val="3"/>
+  </w:num>
+  <w:num w:numId="3" w16cid:durableId="642153251">
+    <w:abstractNumId w:val="4"/>
+  </w:num>
+  <w:num w:numId="4" w16cid:durableId="1472016095">
+    <w:abstractNumId w:val="1"/>
+  </w:num>
+  <w:num w:numId="5" w16cid:durableId="1741709194">
+    <w:abstractNumId w:val="2"/>
+  </w:num>
+  <w:num w:numId="6" w16cid:durableId="984045149">
+    <w:abstractNumId w:val="5"/>
+  </w:num>
+</w:numbering>
+</file>
+
 <file path=word/styles.xml><?xml version="1.0" encoding="utf-8"?>
-<w:styles xmlns:mc="http://schemas.openxmlformats.org/markup-compatibility/2006" xmlns:r="http://schemas.openxmlformats.org/officeDocument/2006/relationships" xmlns:w="http://schemas.openxmlformats.org/wordprocessingml/2006/main" xmlns:w14="http://schemas.microsoft.com/office/word/2010/wordml" xmlns:w15="http://schemas.microsoft.com/office/word/2012/wordml" xmlns:w16cex="http://schemas.microsoft.com/office/word/2018/wordml/cex" xmlns:w16cid="http://schemas.microsoft.com/office/word/2016/wordml/cid" xmlns:w16="http://schemas.microsoft.com/office/word/2018/wordml" xmlns:w16du="http://schemas.microsoft.com/office/word/2023/wordml/word16du" xmlns:w16sdtdh="http://schemas.microsoft.com/office/word/2020/wordml/sdtdatahash" xmlns:w16se="http://schemas.microsoft.com/office/word/2015/wordml/symex" mc:Ignorable="w14 w15 w16se w16cid w16 w16cex w16sdtdh w16du">
+<w:styles xmlns:mc="http://schemas.openxmlformats.org/markup-compatibility/2006" xmlns:r="http://schemas.openxmlformats.org/officeDocument/2006/relationships" xmlns:w="http://schemas.openxmlformats.org/wordprocessingml/2006/main" xmlns:w14="http://schemas.microsoft.com/office/word/2010/wordml" xmlns:w15="http://schemas.microsoft.com/office/word/2012/wordml" xmlns:w16cex="http://schemas.microsoft.com/office/word/2018/wordml/cex" xmlns:w16cid="http://schemas.microsoft.com/office/word/2016/wordml/cid" xmlns:w16="http://schemas.microsoft.com/office/word/2018/wordml" xmlns:w16du="http://schemas.microsoft.com/office/word/2023/wordml/word16du" xmlns:w16sdtdh="http://schemas.microsoft.com/office/word/2020/wordml/sdtdatahash" xmlns:w16sdtfl="http://schemas.microsoft.com/office/word/2024/wordml/sdtformatlock" xmlns:w16se="http://schemas.microsoft.com/office/word/2015/wordml/symex" mc:Ignorable="w14 w15 w16se w16cid w16 w16cex w16sdtdh w16sdtfl w16du">
   <w:docDefaults>
     <w:rPrDefault>
       <w:rPr>
@@ -489,6 +1576,19 @@
     <w:semiHidden/>
     <w:unhideWhenUsed/>
   </w:style>
+  <w:style w:type="paragraph" w:styleId="NormalWeb">
+    <w:name w:val="Normal (Web)"/>
+    <w:basedOn w:val="Normal"/>
+    <w:uiPriority w:val="99"/>
+    <w:semiHidden/>
+    <w:unhideWhenUsed/>
+    <w:rsid w:val="00F5591F"/>
+    <w:rPr>
+      <w:rFonts w:ascii="Times New Roman" w:hAnsi="Times New Roman" w:cs="Times New Roman"/>
+      <w:sz w:val="24"/>
+      <w:szCs w:val="24"/>
+    </w:rPr>
+  </w:style>
 </w:styles>
 </file>
 

</xml_diff>